<commit_message>
added height and width histogram
</commit_message>
<xml_diff>
--- a/EDA.docx
+++ b/EDA.docx
@@ -23,21 +23,7 @@
         <w:rPr>
           <w:lang w:val="en-US"/>
         </w:rPr>
-        <w:t xml:space="preserve"> The photos correspond to </w:t>
-      </w:r>
-      <w:proofErr w:type="gramStart"/>
-      <w:r>
-        <w:rPr>
-          <w:lang w:val="en-US"/>
-        </w:rPr>
-        <w:t>close up</w:t>
-      </w:r>
-      <w:proofErr w:type="gramEnd"/>
-      <w:r>
-        <w:rPr>
-          <w:lang w:val="en-US"/>
-        </w:rPr>
-        <w:t xml:space="preserve"> photos of blades of grass</w:t>
+        <w:t xml:space="preserve"> The photos correspond to close up photos of blades of grass</w:t>
       </w:r>
       <w:r>
         <w:rPr>
@@ -61,69 +47,13 @@
         <w:rPr>
           <w:lang w:val="en-US"/>
         </w:rPr>
-        <w:t xml:space="preserve">How much variation is there across </w:t>
-      </w:r>
-      <w:proofErr w:type="gramStart"/>
-      <w:r>
-        <w:rPr>
-          <w:lang w:val="en-US"/>
-        </w:rPr>
-        <w:t>images?</w:t>
+        <w:t>How much variation is there across images?</w:t>
       </w:r>
       <w:r>
         <w:rPr>
           <w:lang w:val="en-US"/>
         </w:rPr>
-        <w:t>:</w:t>
-      </w:r>
-      <w:proofErr w:type="gramEnd"/>
-      <w:r>
-        <w:rPr>
-          <w:lang w:val="en-US"/>
-        </w:rPr>
-        <w:t xml:space="preserve"> What we can see id that the </w:t>
-      </w:r>
-      <w:proofErr w:type="spellStart"/>
-      <w:r>
-        <w:rPr>
-          <w:lang w:val="en-US"/>
-        </w:rPr>
-        <w:t>paramateres</w:t>
-      </w:r>
-      <w:proofErr w:type="spellEnd"/>
-      <w:r>
-        <w:rPr>
-          <w:lang w:val="en-US"/>
-        </w:rPr>
-        <w:t xml:space="preserve"> for taking the pictures are very well defined they have same lighting and camera </w:t>
-      </w:r>
-      <w:proofErr w:type="gramStart"/>
-      <w:r>
-        <w:rPr>
-          <w:lang w:val="en-US"/>
-        </w:rPr>
-        <w:t>height</w:t>
-      </w:r>
-      <w:proofErr w:type="gramEnd"/>
-      <w:r>
-        <w:rPr>
-          <w:lang w:val="en-US"/>
-        </w:rPr>
-        <w:t xml:space="preserve"> but what varies the most </w:t>
-      </w:r>
-      <w:proofErr w:type="gramStart"/>
-      <w:r>
-        <w:rPr>
-          <w:lang w:val="en-US"/>
-        </w:rPr>
-        <w:t>is  the</w:t>
-      </w:r>
-      <w:proofErr w:type="gramEnd"/>
-      <w:r>
-        <w:rPr>
-          <w:lang w:val="en-US"/>
-        </w:rPr>
-        <w:t xml:space="preserve"> grass color and the dirt where the grass is also some paddocks seem to be dryer.</w:t>
+        <w:t>: What we can see id that the paramateres for taking the pictures are very well defined they have same lighting and camera height but what varies the most is  the grass color and the dirt where the grass is also some paddocks seem to be dryer.</w:t>
       </w:r>
     </w:p>
     <w:p>
@@ -147,21 +77,7 @@
         <w:rPr>
           <w:lang w:val="en-US"/>
         </w:rPr>
-        <w:t xml:space="preserve"> The size of the image </w:t>
-      </w:r>
-      <w:proofErr w:type="gramStart"/>
-      <w:r>
-        <w:rPr>
-          <w:lang w:val="en-US"/>
-        </w:rPr>
-        <w:t>are</w:t>
-      </w:r>
-      <w:proofErr w:type="gramEnd"/>
-      <w:r>
-        <w:rPr>
-          <w:lang w:val="en-US"/>
-        </w:rPr>
-        <w:t xml:space="preserve"> (1000, 2000, 3)</w:t>
+        <w:t xml:space="preserve"> The size of the image are (1000, 2000, 3)</w:t>
       </w:r>
     </w:p>
     <w:p>
@@ -171,6 +87,67 @@
           <w:lang w:val="en-US"/>
         </w:rPr>
       </w:pPr>
+      <w:r>
+        <w:rPr>
+          <w:noProof/>
+          <w:lang w:val="en-US"/>
+        </w:rPr>
+        <w:drawing>
+          <wp:inline distT="0" distB="0" distL="0" distR="0" wp14:anchorId="1009733E" wp14:editId="7535B1D1">
+            <wp:extent cx="5612130" cy="2670810"/>
+            <wp:effectExtent l="0" t="0" r="1270" b="0"/>
+            <wp:docPr id="1784171483" name="Imagen 1"/>
+            <wp:cNvGraphicFramePr>
+              <a:graphicFrameLocks xmlns:a="http://schemas.openxmlformats.org/drawingml/2006/main" noChangeAspect="1"/>
+            </wp:cNvGraphicFramePr>
+            <a:graphic xmlns:a="http://schemas.openxmlformats.org/drawingml/2006/main">
+              <a:graphicData uri="http://schemas.openxmlformats.org/drawingml/2006/picture">
+                <pic:pic xmlns:pic="http://schemas.openxmlformats.org/drawingml/2006/picture">
+                  <pic:nvPicPr>
+                    <pic:cNvPr id="1784171483" name="Imagen 1784171483"/>
+                    <pic:cNvPicPr/>
+                  </pic:nvPicPr>
+                  <pic:blipFill>
+                    <a:blip r:embed="rId5" cstate="print">
+                      <a:extLst>
+                        <a:ext uri="{28A0092B-C50C-407E-A947-70E740481C1C}">
+                          <a14:useLocalDpi xmlns:a14="http://schemas.microsoft.com/office/drawing/2010/main" val="0"/>
+                        </a:ext>
+                      </a:extLst>
+                    </a:blip>
+                    <a:stretch>
+                      <a:fillRect/>
+                    </a:stretch>
+                  </pic:blipFill>
+                  <pic:spPr>
+                    <a:xfrm>
+                      <a:off x="0" y="0"/>
+                      <a:ext cx="5612130" cy="2670810"/>
+                    </a:xfrm>
+                    <a:prstGeom prst="rect">
+                      <a:avLst/>
+                    </a:prstGeom>
+                  </pic:spPr>
+                </pic:pic>
+              </a:graphicData>
+            </a:graphic>
+          </wp:inline>
+        </w:drawing>
+      </w:r>
+    </w:p>
+    <w:p>
+      <w:pPr>
+        <w:pStyle w:val="Prrafodelista"/>
+        <w:rPr>
+          <w:lang w:val="en-US"/>
+        </w:rPr>
+      </w:pPr>
+      <w:r>
+        <w:rPr>
+          <w:lang w:val="en-US"/>
+        </w:rPr>
+        <w:t>This is valid for all images.</w:t>
+      </w:r>
     </w:p>
     <w:sectPr>
       <w:pgSz w:w="12240" w:h="15840"/>

</xml_diff>